<commit_message>
nâng cấp 2.0 theo yêu cầu của kế toán
</commit_message>
<xml_diff>
--- a/my_custom_addons/dl_wood_traceability/static/TEMPLATES/TEMPLATE_CN_BKLS.docx
+++ b/my_custom_addons/dl_wood_traceability/static/TEMPLATES/TEMPLATE_CN_BKLS.docx
@@ -903,7 +903,16 @@
           <w:sz w:val="22"/>
           <w:szCs w:val="22"/>
         </w:rPr>
-        <w:t>{{bkls_number}} {{</w:t>
+        <w:t>………………../BKLS</w:t>
+      </w:r>
+      <w:r>
+        <w:rPr>
+          <w:i/>
+          <w:iCs/>
+          <w:sz w:val="22"/>
+          <w:szCs w:val="22"/>
+        </w:rPr>
+        <w:t xml:space="preserve"> {{</w:t>
       </w:r>
       <w:r>
         <w:rPr>

</xml_diff>

<commit_message>
sửa template chia nhỏ bảng kê
</commit_message>
<xml_diff>
--- a/my_custom_addons/dl_wood_traceability/static/TEMPLATES/TEMPLATE_CN_BKLS.docx
+++ b/my_custom_addons/dl_wood_traceability/static/TEMPLATES/TEMPLATE_CN_BKLS.docx
@@ -624,7 +624,42 @@
           <w:sz w:val="22"/>
           <w:szCs w:val="22"/>
         </w:rPr>
-        <w:t>{{delivery_count_day}} ngày; {{vietnamese_x_delivery_start_date}} đến {{vietnamese_x_delivery_end_date}}</w:t>
+        <w:t xml:space="preserve">1 </w:t>
+      </w:r>
+      <w:r>
+        <w:rPr>
+          <w:sz w:val="22"/>
+          <w:szCs w:val="22"/>
+        </w:rPr>
+        <w:t xml:space="preserve">ngày; </w:t>
+      </w:r>
+      <w:r>
+        <w:rPr>
+          <w:sz w:val="22"/>
+          <w:szCs w:val="22"/>
+        </w:rPr>
+        <w:t>{{vietnamses_bkls_date}}</w:t>
+      </w:r>
+      <w:r>
+        <w:rPr>
+          <w:sz w:val="22"/>
+          <w:szCs w:val="22"/>
+        </w:rPr>
+        <w:t xml:space="preserve"> </w:t>
+      </w:r>
+      <w:r>
+        <w:rPr>
+          <w:sz w:val="22"/>
+          <w:szCs w:val="22"/>
+        </w:rPr>
+        <w:t xml:space="preserve">đến </w:t>
+      </w:r>
+      <w:r>
+        <w:rPr>
+          <w:sz w:val="22"/>
+          <w:szCs w:val="22"/>
+        </w:rPr>
+        <w:t>{{vietnamses_bkls_date}}</w:t>
       </w:r>
       <w:r>
         <w:rPr>

</xml_diff>